<commit_message>
Add Logitech Gaming Mouse to MY PROJECTS
</commit_message>
<xml_diff>
--- a/Parinya_Daengsawat_Resume_2026.docx
+++ b/Parinya_Daengsawat_Resume_2026.docx
@@ -294,7 +294,19 @@
         <w:rPr>
           <w:color w:val="FFFFFF" w:themeColor="background1"/>
         </w:rPr>
-        <w:t xml:space="preserve"> +6698 863 9412 </w:t>
+        <w:t xml:space="preserve"> </w:t>
+      </w:r>
+      <w:r>
+        <w:rPr>
+          <w:color w:val="FFFFFF" w:themeColor="background1"/>
+        </w:rPr>
+        <w:t>0</w:t>
+      </w:r>
+      <w:r>
+        <w:rPr>
+          <w:color w:val="FFFFFF" w:themeColor="background1"/>
+        </w:rPr>
+        <w:t xml:space="preserve">98 863 9412 </w:t>
       </w:r>
     </w:p>
     <w:p>
@@ -367,33 +379,25 @@
         <w:rPr>
           <w:color w:val="FFFFFF" w:themeColor="background1"/>
         </w:rPr>
+        <w:t xml:space="preserve"> SUA</w:t>
+      </w:r>
+      <w:r>
+        <w:rPr>
+          <w:color w:val="FFFFFF" w:themeColor="background1"/>
+        </w:rPr>
+        <w:t>,</w:t>
+      </w:r>
+      <w:r>
+        <w:rPr>
+          <w:color w:val="FFFFFF" w:themeColor="background1"/>
+        </w:rPr>
         <w:t xml:space="preserve"> </w:t>
       </w:r>
-      <w:proofErr w:type="gramStart"/>
       <w:r>
         <w:rPr>
           <w:color w:val="FFFFFF" w:themeColor="background1"/>
         </w:rPr>
-        <w:t>SUA</w:t>
-      </w:r>
-      <w:r>
-        <w:rPr>
-          <w:color w:val="FFFFFF" w:themeColor="background1"/>
-        </w:rPr>
-        <w:t>,</w:t>
-      </w:r>
-      <w:r>
-        <w:rPr>
-          <w:color w:val="FFFFFF" w:themeColor="background1"/>
-        </w:rPr>
-        <w:t>PATHUM</w:t>
-      </w:r>
-      <w:proofErr w:type="gramEnd"/>
-      <w:r>
-        <w:rPr>
-          <w:color w:val="FFFFFF" w:themeColor="background1"/>
-        </w:rPr>
-        <w:t xml:space="preserve"> THANI </w:t>
+        <w:t xml:space="preserve">PATHUM THANI </w:t>
       </w:r>
     </w:p>
     <w:p>
@@ -1340,7 +1344,6 @@
           <w:numId w:val="3"/>
         </w:numPr>
         <w:rPr>
-          <w:rFonts w:hint="cs"/>
           <w:sz w:val="28"/>
           <w:cs/>
         </w:rPr>
@@ -3263,6 +3266,7 @@
   <w:style w:type="character" w:default="1" w:styleId="DefaultParagraphFont">
     <w:name w:val="Default Paragraph Font"/>
     <w:uiPriority w:val="1"/>
+    <w:semiHidden/>
     <w:unhideWhenUsed/>
   </w:style>
   <w:style w:type="table" w:default="1" w:styleId="TableNormal">

</xml_diff>